<commit_message>
Comienzo de la página de inicio
</commit_message>
<xml_diff>
--- a/docs/ERS-ECommerce.docx
+++ b/docs/ERS-ECommerce.docx
@@ -91,7 +91,27 @@
                                     <w:sz w:val="40"/>
                                     <w:szCs w:val="40"/>
                                   </w:rPr>
-                                  <w:t>/02/2026</w:t>
+                                  <w:t>/0</w:t>
+                                </w:r>
+                                <w:r>
+                                  <w:rPr>
+                                    <w:rFonts w:ascii="Times New Roman" w:hAnsi="Times New Roman" w:cs="Times New Roman"/>
+                                    <w:b/>
+                                    <w:bCs/>
+                                    <w:sz w:val="40"/>
+                                    <w:szCs w:val="40"/>
+                                  </w:rPr>
+                                  <w:t>3</w:t>
+                                </w:r>
+                                <w:r>
+                                  <w:rPr>
+                                    <w:rFonts w:ascii="Times New Roman" w:hAnsi="Times New Roman" w:cs="Times New Roman"/>
+                                    <w:b/>
+                                    <w:bCs/>
+                                    <w:sz w:val="40"/>
+                                    <w:szCs w:val="40"/>
+                                  </w:rPr>
+                                  <w:t>/2026</w:t>
                                 </w:r>
                               </w:p>
                             </w:txbxContent>
@@ -156,7 +176,27 @@
                               <w:sz w:val="40"/>
                               <w:szCs w:val="40"/>
                             </w:rPr>
-                            <w:t>/02/2026</w:t>
+                            <w:t>/0</w:t>
+                          </w:r>
+                          <w:r>
+                            <w:rPr>
+                              <w:rFonts w:ascii="Times New Roman" w:hAnsi="Times New Roman" w:cs="Times New Roman"/>
+                              <w:b/>
+                              <w:bCs/>
+                              <w:sz w:val="40"/>
+                              <w:szCs w:val="40"/>
+                            </w:rPr>
+                            <w:t>3</w:t>
+                          </w:r>
+                          <w:r>
+                            <w:rPr>
+                              <w:rFonts w:ascii="Times New Roman" w:hAnsi="Times New Roman" w:cs="Times New Roman"/>
+                              <w:b/>
+                              <w:bCs/>
+                              <w:sz w:val="40"/>
+                              <w:szCs w:val="40"/>
+                            </w:rPr>
+                            <w:t>/2026</w:t>
                           </w:r>
                         </w:p>
                       </w:txbxContent>
@@ -1053,7 +1093,23 @@
                 <w:sz w:val="22"/>
                 <w:szCs w:val="22"/>
               </w:rPr>
-              <w:t>21/06/2026</w:t>
+              <w:t>21/0</w:t>
+            </w:r>
+            <w:r>
+              <w:rPr>
+                <w:rFonts w:ascii="Times New Roman" w:hAnsi="Times New Roman" w:cs="Times New Roman"/>
+                <w:sz w:val="22"/>
+                <w:szCs w:val="22"/>
+              </w:rPr>
+              <w:t>3</w:t>
+            </w:r>
+            <w:r>
+              <w:rPr>
+                <w:rFonts w:ascii="Times New Roman" w:hAnsi="Times New Roman" w:cs="Times New Roman"/>
+                <w:sz w:val="22"/>
+                <w:szCs w:val="22"/>
+              </w:rPr>
+              <w:t>/2026</w:t>
             </w:r>
           </w:p>
         </w:tc>
@@ -1434,6 +1490,15 @@
     </w:p>
     <w:sdt>
       <w:sdtPr>
+        <w:rPr>
+          <w:rFonts w:asciiTheme="minorHAnsi" w:eastAsiaTheme="minorHAnsi" w:hAnsiTheme="minorHAnsi" w:cstheme="minorBidi"/>
+          <w:color w:val="auto"/>
+          <w:kern w:val="2"/>
+          <w:sz w:val="24"/>
+          <w:szCs w:val="24"/>
+          <w:lang w:eastAsia="en-US"/>
+          <w14:ligatures w14:val="standardContextual"/>
+        </w:rPr>
         <w:id w:val="2092421201"/>
         <w:docPartObj>
           <w:docPartGallery w:val="Table of Contents"/>
@@ -1442,15 +1507,8 @@
       </w:sdtPr>
       <w:sdtEndPr>
         <w:rPr>
-          <w:rFonts w:asciiTheme="minorHAnsi" w:eastAsiaTheme="minorHAnsi" w:hAnsiTheme="minorHAnsi" w:cstheme="minorBidi"/>
           <w:b/>
           <w:bCs/>
-          <w:color w:val="auto"/>
-          <w:kern w:val="2"/>
-          <w:sz w:val="24"/>
-          <w:szCs w:val="24"/>
-          <w:lang w:eastAsia="en-US"/>
-          <w14:ligatures w14:val="standardContextual"/>
         </w:rPr>
       </w:sdtEndPr>
       <w:sdtContent>

</xml_diff>